<commit_message>
Clore le dossier : recaler le README et tenir la convention
</commit_message>
<xml_diff>
--- a/docs/Manuel_Sorabel_Data_Gateway.docx
+++ b/docs/Manuel_Sorabel_Data_Gateway.docx
@@ -4003,7 +4003,7 @@
     </w:p>
     <w:p>
       <w:r>
-        <w:t xml:space="preserve">Autrement dit, un morceau ne commence pas par « Étape 3 : dévisser le capot » mais par « Fiche technique disjoncteur 40 A | REF-8842 | v2.1 — Étape 3 : dévisser le capot ».</w:t>
+        <w:t xml:space="preserve">Autrement dit, un morceau ne commence pas par « Étape 3 : dévisser le capot » mais par « Fiche technique disjoncteur 40 A | REF-8842 | v2.1, puis Étape 3 : dévisser le capot ».</w:t>
       </w:r>
     </w:p>
     <w:p>
@@ -11655,7 +11655,7 @@
               <w:spacing w:after="40"/>
             </w:pPr>
             <w:r>
-              <w:t xml:space="preserve">—</w:t>
+              <w:t xml:space="preserve">non mesure</w:t>
             </w:r>
           </w:p>
         </w:tc>
@@ -13356,7 +13356,7 @@
         <w:t xml:space="preserve">leurs noms mentiraient</w:t>
       </w:r>
       <w:r>
-        <w:t xml:space="preserve"> — ce qui est pire qu'un canal unique, car un nom qui promet des droits qu'il ne donne pas trompe l'utilisateur.</w:t>
+        <w:t xml:space="preserve">, ce qui est pire qu'un canal unique, car un nom qui promet des droits qu'il ne donne pas trompe l'utilisateur.</w:t>
       </w:r>
     </w:p>
     <w:p>
@@ -17027,7 +17027,7 @@
         <w:t xml:space="preserve">E1</w:t>
       </w:r>
       <w:r>
-        <w:t xml:space="preserve"> — une réponse documentaire cite titre, référence, date</w:t>
+        <w:t xml:space="preserve"> : une réponse documentaire cite titre, référence, date</w:t>
       </w:r>
     </w:p>
     <w:p>
@@ -17044,7 +17044,7 @@
         <w:t xml:space="preserve">E1</w:t>
       </w:r>
       <w:r>
-        <w:t xml:space="preserve"> — une question hors corpus rend une </w:t>
+        <w:t xml:space="preserve"> : une question hors corpus rend une </w:t>
       </w:r>
       <w:r>
         <w:rPr>
@@ -17067,7 +17067,7 @@
         <w:t xml:space="preserve">E1</w:t>
       </w:r>
       <w:r>
-        <w:t xml:space="preserve"> — une question sur une référence cite </w:t>
+        <w:t xml:space="preserve"> : une question sur une référence cite </w:t>
       </w:r>
       <w:r>
         <w:rPr>
@@ -17093,7 +17093,7 @@
         <w:t xml:space="preserve">E2</w:t>
       </w:r>
       <w:r>
-        <w:t xml:space="preserve"> — une référence exacte remonte en tête</w:t>
+        <w:t xml:space="preserve"> : une référence exacte remonte en tête</w:t>
       </w:r>
     </w:p>
     <w:p>
@@ -17110,7 +17110,7 @@
         <w:t xml:space="preserve">E2</w:t>
       </w:r>
       <w:r>
-        <w:t xml:space="preserve"> — une question en langage naturel aboutit</w:t>
+        <w:t xml:space="preserve"> : une question en langage naturel aboutit</w:t>
       </w:r>
     </w:p>
     <w:p>
@@ -17127,7 +17127,7 @@
         <w:t xml:space="preserve">E3</w:t>
       </w:r>
       <w:r>
-        <w:t xml:space="preserve"> — une demande d'écriture est refusée</w:t>
+        <w:t xml:space="preserve"> : une demande d'écriture est refusée</w:t>
       </w:r>
     </w:p>
     <w:p>
@@ -17144,7 +17144,7 @@
         <w:t xml:space="preserve">E3</w:t>
       </w:r>
       <w:r>
-        <w:t xml:space="preserve"> — la requête est renvoyée avec le résultat</w:t>
+        <w:t xml:space="preserve"> : la requête est renvoyée avec le résultat</w:t>
       </w:r>
     </w:p>
     <w:p>
@@ -17161,7 +17161,7 @@
         <w:t xml:space="preserve">E3</w:t>
       </w:r>
       <w:r>
-        <w:t xml:space="preserve"> — la requête d'un refus est visible</w:t>
+        <w:t xml:space="preserve"> : la requête d'un refus est visible</w:t>
       </w:r>
     </w:p>
     <w:p>
@@ -17178,7 +17178,7 @@
         <w:t xml:space="preserve">E4</w:t>
       </w:r>
       <w:r>
-        <w:t xml:space="preserve"> — les deux profils ont deux catalogues d'outils différents</w:t>
+        <w:t xml:space="preserve"> : les deux profils ont deux catalogues d'outils différents</w:t>
       </w:r>
     </w:p>
     <w:p>
@@ -17195,7 +17195,7 @@
         <w:t xml:space="preserve">E4</w:t>
       </w:r>
       <w:r>
-        <w:t xml:space="preserve"> — un outil interdit rend un refus, pas une erreur technique</w:t>
+        <w:t xml:space="preserve"> : un outil interdit rend un refus, pas une erreur technique</w:t>
       </w:r>
     </w:p>
     <w:p>
@@ -17212,7 +17212,7 @@
         <w:t xml:space="preserve">E5</w:t>
       </w:r>
       <w:r>
-        <w:t xml:space="preserve"> — une colonne sensible est refusée au profil restreint</w:t>
+        <w:t xml:space="preserve"> : une colonne sensible est refusée au profil restreint</w:t>
       </w:r>
     </w:p>
     <w:p>
@@ -17229,7 +17229,7 @@
         <w:t xml:space="preserve">E5</w:t>
       </w:r>
       <w:r>
-        <w:t xml:space="preserve"> — le refus tient même par un tri ou une sous-requête</w:t>
+        <w:t xml:space="preserve"> : le refus tient même par un tri ou une sous-requête</w:t>
       </w:r>
     </w:p>
     <w:p>
@@ -17246,7 +17246,7 @@
         <w:t xml:space="preserve">E5</w:t>
       </w:r>
       <w:r>
-        <w:t xml:space="preserve"> — le journal contient </w:t>
+        <w:t xml:space="preserve"> : le journal contient </w:t>
       </w:r>
       <w:r>
         <w:rPr>
@@ -17272,7 +17272,7 @@
         <w:t xml:space="preserve">E6</w:t>
       </w:r>
       <w:r>
-        <w:t xml:space="preserve"> — le rapport de mesure existe, </w:t>
+        <w:t xml:space="preserve"> : le rapport de mesure existe, </w:t>
       </w:r>
       <w:r>
         <w:rPr>

</xml_diff>